<commit_message>
Make shared lesson link prominent on lesson plan first page
</commit_message>
<xml_diff>
--- a/Term-1/Grade-9/Chapter-1-Listening-2-Getting-There/Getting-There-Lesson-Plan.docx
+++ b/Term-1/Grade-9/Chapter-1-Listening-2-Getting-There/Getting-There-Lesson-Plan.docx
@@ -466,6 +466,20 @@
               <w:t>Clear directions and navigation · pp. 14–15</w:t>
             </w:r>
           </w:p>
+          <w:p>
+            <w:pPr>
+              <w:spacing w:before="60" w:after="0"/>
+            </w:pPr>
+            <w:hyperlink r:id="rId13">
+              <w:r>
+                <w:rPr>
+                  <w:color w:val="0066CC"/>
+                  <w:u w:val="single"/>
+                </w:rPr>
+                <w:t>▶ OPEN INTERACTIVE LESSON — click here</w:t>
+              </w:r>
+            </w:hyperlink>
+          </w:p>
         </w:tc>
         <w:tc>
           <w:tcPr>
@@ -1399,13 +1413,11 @@
               <w:t>Audio 1 · book pp. 14–15</w:t>
               <w:br/>
               <w:t>Smart board / map drawing</w:t>
-              <w:br/>
-              <w:t>Getting-There-Interactive-Lesson.html</w:t>
-            </w:r>
-          </w:p>
-          <w:p>
-            <w:pPr>
-              <w:spacing w:after="0"/>
+            </w:r>
+          </w:p>
+          <w:p>
+            <w:pPr>
+              <w:spacing w:before="60" w:after="0"/>
             </w:pPr>
             <w:hyperlink r:id="rId13">
               <w:r>
@@ -1413,7 +1425,7 @@
                   <w:color w:val="0066CC"/>
                   <w:u w:val="single"/>
                 </w:rPr>
-                <w:t>Open shared lesson online</w:t>
+                <w:t>▶ OPEN INTERACTIVE LESSON — click here</w:t>
               </w:r>
             </w:hyperlink>
           </w:p>

</xml_diff>